<commit_message>
References on 2 columns
</commit_message>
<xml_diff>
--- a/A5/ReportTechnicalDebt.docx
+++ b/A5/ReportTechnicalDebt.docx
@@ -12576,6 +12576,38 @@
     </w:p>
     <w:p>
       <w:pPr>
+        <w:rPr>
+          <w:rFonts w:ascii="Times New Roman" w:hAnsi="Times New Roman" w:cs="Times New Roman"/>
+          <w:b/>
+          <w:bCs/>
+          <w:sz w:val="32"/>
+          <w:szCs w:val="32"/>
+        </w:rPr>
+      </w:pPr>
+    </w:p>
+    <w:p>
+      <w:pPr>
+        <w:widowControl/>
+        <w:numPr>
+          <w:ilvl w:val="0"/>
+          <w:numId w:val="33"/>
+        </w:numPr>
+        <w:spacing w:after="160" w:line="278" w:lineRule="auto"/>
+        <w:rPr>
+          <w:rFonts w:ascii="Times New Roman" w:hAnsi="Times New Roman" w:cs="Times New Roman"/>
+          <w:sz w:val="20"/>
+          <w:szCs w:val="20"/>
+        </w:rPr>
+        <w:sectPr>
+          <w:pgSz w:w="12240" w:h="15840"/>
+          <w:pgMar w:top="1440" w:right="1440" w:bottom="1440" w:left="1440" w:header="0" w:footer="720" w:gutter="0"/>
+          <w:pgNumType w:start="1"/>
+          <w:cols w:space="720"/>
+        </w:sectPr>
+      </w:pPr>
+    </w:p>
+    <w:p>
+      <w:pPr>
         <w:widowControl/>
         <w:numPr>
           <w:ilvl w:val="0"/>
@@ -13210,8 +13242,16 @@
           <w:sz w:val="20"/>
           <w:szCs w:val="20"/>
         </w:rPr>
+        <w:t xml:space="preserve">Lenarduzzi, V., Besker, T., Taibi, D., Martini, A., &amp; Fontana, F. A. (2021). A systematic literature review on Technical Debt </w:t>
+      </w:r>
+      <w:r>
+        <w:rPr>
+          <w:rFonts w:ascii="Times New Roman" w:hAnsi="Times New Roman" w:cs="Times New Roman"/>
+          <w:sz w:val="20"/>
+          <w:szCs w:val="20"/>
+        </w:rPr>
         <w:lastRenderedPageBreak/>
-        <w:t>Lenarduzzi, V., Besker, T., Taibi, D., Martini, A., &amp; Fontana, F. A. (2021). A systematic literature review on Technical Debt prioritization: Strategies, processes, factors, and tools. Journal of Systems and Software, 171, 110827.</w:t>
+        <w:t>prioritization: Strategies, processes, factors, and tools. Journal of Systems and Software, 171, 110827.</w:t>
       </w:r>
       <w:r>
         <w:rPr>
@@ -13541,7 +13581,16 @@
             <w:sz w:val="20"/>
             <w:szCs w:val="20"/>
           </w:rPr>
-          <w:t>https://www.hbs.edu/ris/Publication%20Files/2016-JSS%20Technical%20Debt_d793c712-5160-4aa9-8761-781b444cc75f.pdf</w:t>
+          <w:t>https://www.hbs.edu/ris/Publication%20Files/2</w:t>
+        </w:r>
+        <w:r>
+          <w:rPr>
+            <w:rStyle w:val="Hyperlink"/>
+            <w:rFonts w:ascii="Times New Roman" w:hAnsi="Times New Roman" w:cs="Times New Roman"/>
+            <w:sz w:val="20"/>
+            <w:szCs w:val="20"/>
+          </w:rPr>
+          <w:t>016-JSS%20Technical%20Debt_d793c712-5160-4aa9-8761-781b444cc75f.pdf</w:t>
         </w:r>
       </w:hyperlink>
     </w:p>
@@ -13694,10 +13743,11 @@
       </w:hyperlink>
     </w:p>
     <w:sectPr>
+      <w:type w:val="continuous"/>
       <w:pgSz w:w="12240" w:h="15840"/>
       <w:pgMar w:top="1440" w:right="1440" w:bottom="1440" w:left="1440" w:header="0" w:footer="720" w:gutter="0"/>
       <w:pgNumType w:start="1"/>
-      <w:cols w:space="720"/>
+      <w:cols w:num="2" w:space="340"/>
     </w:sectPr>
   </w:body>
 </w:document>

</xml_diff>